<commit_message>
Remove the APC placeholder from the cover letter
BMC handles waivers with a checkbox and a post-submission flow, and states
that the editorial team cannot see the request and that it plays no part in
the editorial decision. So the request does not belong in the cover letter,
which is read by exactly those editors. The marker is deleted rather than
filled.

It was not cosmetic: the marker rendered as visible text in COVER_LETTER.docx
two lines above the signature. An earlier check missed it by searching the
docx XML for a literal "<<", which is stored escaped as "&lt;&lt;".

SUBMISSION.md is in PACKAGE_FILES but not the evidence lock, so only the
package digest moved and neither Zenodo record needs republishing. No
placeholder now remains in any release document.

Co-Authored-By: Claude Opus 5 <noreply@anthropic.com>
</commit_message>
<xml_diff>
--- a/results/manuscript/submission/COVER_LETTER.docx
+++ b/results/manuscript/submission/COVER_LETTER.docx
@@ -258,14 +258,6 @@
       </w:r>
       <w:r>
         <w:t xml:space="preserve">Generative AI assistance is disclosed in the Methods section.</w:t>
-      </w:r>
-    </w:p>
-    <w:p>
-      <w:pPr>
-        <w:pStyle w:val="BodyText"/>
-      </w:pPr>
-      <w:r>
-        <w:t xml:space="preserve">&lt;&lt;LATER: request an APC waiver here if one is needed – it can only be requested at submission&gt;&gt;</w:t>
       </w:r>
     </w:p>
     <w:p>

</xml_diff>